<commit_message>
#48 updated Assembly and firmware upload guide
</commit_message>
<xml_diff>
--- a/docs/Dev Files/Smart Button V2.1/Assembly and Firmware Upload Guide.docx
+++ b/docs/Dev Files/Smart Button V2.1/Assembly and Firmware Upload Guide.docx
@@ -110,13 +110,7 @@
         <w:rPr>
           <w:b/>
         </w:rPr>
-        <w:t>Prepare the Board for programming by connecting it to Voltlink</w:t>
-      </w:r>
-      <w:r>
-        <w:rPr>
-          <w:b/>
-        </w:rPr>
-        <w:t xml:space="preserve"> programmer </w:t>
+        <w:t xml:space="preserve">Prepare the Board for programming by connecting it to Voltlink programmer </w:t>
       </w:r>
     </w:p>
     <w:p>
@@ -124,13 +118,7 @@
         <w:pStyle w:val="ListParagraph"/>
       </w:pPr>
       <w:r>
-        <w:t>Use the connection cable provided with the Voltlink adapter to connect with</w:t>
-      </w:r>
-      <w:r>
-        <w:t xml:space="preserve"> the Voltlink connector marked</w:t>
-      </w:r>
-      <w:r>
-        <w:t xml:space="preserve"> in the Board</w:t>
+        <w:t>Use the connection cable provided with the Voltlink adapter to connect with the Voltlink connector marked in the Board</w:t>
       </w:r>
     </w:p>
     <w:p>
@@ -492,13 +480,7 @@
         <w:rPr>
           <w:b/>
         </w:rPr>
-        <w:t xml:space="preserve"> Arduino IDE </w:t>
-      </w:r>
-      <w:r>
-        <w:rPr>
-          <w:b/>
-        </w:rPr>
-        <w:t xml:space="preserve">for </w:t>
+        <w:t xml:space="preserve"> Arduino IDE for </w:t>
       </w:r>
       <w:r>
         <w:rPr>
@@ -525,20 +507,11 @@
       </w:r>
       <w:proofErr w:type="spellStart"/>
       <w:r>
-        <w:t>E</w:t>
-      </w:r>
-      <w:r>
-        <w:t>spressif</w:t>
+        <w:t>Espressif</w:t>
       </w:r>
       <w:proofErr w:type="spellEnd"/>
       <w:r>
-        <w:t xml:space="preserve"> systems</w:t>
-      </w:r>
-      <w:r>
-        <w:t>” as</w:t>
-      </w:r>
-      <w:r>
-        <w:t xml:space="preserve"> shown in image below</w:t>
+        <w:t xml:space="preserve"> systems” as shown in image below</w:t>
       </w:r>
     </w:p>
     <w:p>
@@ -1023,11 +996,36 @@
       </w:pPr>
     </w:p>
     <w:p>
+      <w:r>
+        <w:t xml:space="preserve"> </w:t>
+      </w:r>
+    </w:p>
+    <w:p>
+      <w:r>
+        <w:br w:type="page"/>
+      </w:r>
+    </w:p>
+    <w:p>
+      <w:pPr>
+        <w:rPr>
+          <w:b/>
+        </w:rPr>
+      </w:pPr>
+      <w:r>
+        <w:rPr>
+          <w:b/>
+        </w:rPr>
+        <w:lastRenderedPageBreak/>
+        <w:t>Hardware Testing Guide</w:t>
+      </w:r>
+      <w:r>
+        <w:rPr>
+          <w:b/>
+        </w:rPr>
+        <w:t>:</w:t>
+      </w:r>
       <w:bookmarkStart w:id="0" w:name="_GoBack"/>
       <w:bookmarkEnd w:id="0"/>
-      <w:r>
-        <w:t xml:space="preserve"> </w:t>
-      </w:r>
     </w:p>
     <w:sectPr>
       <w:pgSz w:w="11906" w:h="16838"/>

</xml_diff>

<commit_message>
#48 updated program upload guide
</commit_message>
<xml_diff>
--- a/docs/Dev Files/Smart Button V2.1/Assembly and Firmware Upload Guide.docx
+++ b/docs/Dev Files/Smart Button V2.1/Assembly and Firmware Upload Guide.docx
@@ -299,8 +299,6 @@
         <w:lastRenderedPageBreak/>
         <w:t>Set up the firmware upload and development environment:</w:t>
       </w:r>
-      <w:bookmarkStart w:id="0" w:name="_GoBack"/>
-      <w:bookmarkEnd w:id="0"/>
       <w:r>
         <w:rPr>
           <w:b/>
@@ -618,6 +616,106 @@
         </w:drawing>
       </w:r>
     </w:p>
+    <w:p>
+      <w:pPr>
+        <w:rPr>
+          <w:b/>
+          <w:bCs/>
+          <w:u w:val="single"/>
+        </w:rPr>
+      </w:pPr>
+      <w:r>
+        <w:rPr>
+          <w:b/>
+          <w:bCs/>
+          <w:u w:val="single"/>
+          <w:lang w:val="en-PK"/>
+        </w:rPr>
+        <w:lastRenderedPageBreak/>
+        <w:t>Program O</w:t>
+      </w:r>
+      <w:r>
+        <w:rPr>
+          <w:b/>
+          <w:bCs/>
+          <w:u w:val="single"/>
+          <w:lang w:val="en-PK"/>
+        </w:rPr>
+        <w:t>utput After Initial Code Upload</w:t>
+      </w:r>
+      <w:r>
+        <w:rPr>
+          <w:b/>
+          <w:bCs/>
+          <w:u w:val="single"/>
+        </w:rPr>
+        <w:t>:</w:t>
+      </w:r>
+    </w:p>
+    <w:p>
+      <w:pPr>
+        <w:rPr>
+          <w:b/>
+          <w:bCs/>
+          <w:u w:val="single"/>
+        </w:rPr>
+      </w:pPr>
+    </w:p>
+    <w:p>
+      <w:pPr>
+        <w:rPr>
+          <w:bCs/>
+        </w:rPr>
+      </w:pPr>
+      <w:r>
+        <w:t>Upon uploading the code for the first time, the following output is expected:</w:t>
+      </w:r>
+    </w:p>
+    <w:p>
+      <w:pPr>
+        <w:pStyle w:val="ListParagraph"/>
+        <w:numPr>
+          <w:ilvl w:val="0"/>
+          <w:numId w:val="2"/>
+        </w:numPr>
+        <w:spacing w:line="256" w:lineRule="auto"/>
+      </w:pPr>
+      <w:r>
+        <w:t xml:space="preserve">After a few seconds, all </w:t>
+      </w:r>
+      <w:r>
+        <w:t>six</w:t>
+      </w:r>
+      <w:r>
+        <w:t xml:space="preserve"> LEDs will begin to fade in and out in white for a short duration.</w:t>
+      </w:r>
+    </w:p>
+    <w:p>
+      <w:pPr>
+        <w:pStyle w:val="ListParagraph"/>
+        <w:numPr>
+          <w:ilvl w:val="0"/>
+          <w:numId w:val="2"/>
+        </w:numPr>
+      </w:pPr>
+      <w:r>
+        <w:t xml:space="preserve">Following the white fading effect, the LEDs will start blinking one after another in </w:t>
+      </w:r>
+      <w:r>
+        <w:t>yellow</w:t>
+      </w:r>
+      <w:r>
+        <w:t xml:space="preserve">. This indicates that Bluetooth </w:t>
+      </w:r>
+      <w:bookmarkStart w:id="0" w:name="_GoBack"/>
+      <w:bookmarkEnd w:id="0"/>
+      <w:r>
+        <w:t>has been turned ON</w:t>
+      </w:r>
+      <w:r>
+        <w:t>.</w:t>
+      </w:r>
+    </w:p>
     <w:sectPr>
       <w:pgSz w:w="11906" w:h="16838"/>
       <w:pgMar w:top="1440" w:right="1440" w:bottom="1440" w:left="1440" w:header="708" w:footer="708" w:gutter="0"/>
@@ -631,6 +729,99 @@
 <file path=word/numbering.xml><?xml version="1.0" encoding="utf-8"?>
 <w:numbering xmlns:wpc="http://schemas.microsoft.com/office/word/2010/wordprocessingCanvas" xmlns:mc="http://schemas.openxmlformats.org/markup-compatibility/2006" xmlns:o="urn:schemas-microsoft-com:office:office" xmlns:r="http://schemas.openxmlformats.org/officeDocument/2006/relationships" xmlns:m="http://schemas.openxmlformats.org/officeDocument/2006/math" xmlns:v="urn:schemas-microsoft-com:vml" xmlns:wp14="http://schemas.microsoft.com/office/word/2010/wordprocessingDrawing" xmlns:wp="http://schemas.openxmlformats.org/drawingml/2006/wordprocessingDrawing" xmlns:w10="urn:schemas-microsoft-com:office:word" xmlns:w="http://schemas.openxmlformats.org/wordprocessingml/2006/main" xmlns:w14="http://schemas.microsoft.com/office/word/2010/wordml" xmlns:w15="http://schemas.microsoft.com/office/word/2012/wordml" xmlns:wpg="http://schemas.microsoft.com/office/word/2010/wordprocessingGroup" xmlns:wpi="http://schemas.microsoft.com/office/word/2010/wordprocessingInk" xmlns:wne="http://schemas.microsoft.com/office/word/2006/wordml" xmlns:wps="http://schemas.microsoft.com/office/word/2010/wordprocessingShape" mc:Ignorable="w14 w15 wp14">
   <w:abstractNum w:abstractNumId="0" w15:restartNumberingAfterBreak="0">
+    <w:nsid w:val="1B890FD7"/>
+    <w:multiLevelType w:val="hybridMultilevel"/>
+    <w:tmpl w:val="F7D89AFA"/>
+    <w:lvl w:ilvl="0" w:tplc="0C00000F">
+      <w:start w:val="1"/>
+      <w:numFmt w:val="decimal"/>
+      <w:lvlText w:val="%1."/>
+      <w:lvlJc w:val="left"/>
+      <w:pPr>
+        <w:ind w:left="720" w:hanging="360"/>
+      </w:pPr>
+      <w:rPr>
+        <w:b w:val="0"/>
+        <w:strike w:val="0"/>
+        <w:dstrike w:val="0"/>
+        <w:u w:val="none"/>
+        <w:effect w:val="none"/>
+      </w:rPr>
+    </w:lvl>
+    <w:lvl w:ilvl="1" w:tplc="0C000019">
+      <w:start w:val="1"/>
+      <w:numFmt w:val="lowerLetter"/>
+      <w:lvlText w:val="%2."/>
+      <w:lvlJc w:val="left"/>
+      <w:pPr>
+        <w:ind w:left="1440" w:hanging="360"/>
+      </w:pPr>
+    </w:lvl>
+    <w:lvl w:ilvl="2" w:tplc="0C00001B">
+      <w:start w:val="1"/>
+      <w:numFmt w:val="lowerRoman"/>
+      <w:lvlText w:val="%3."/>
+      <w:lvlJc w:val="right"/>
+      <w:pPr>
+        <w:ind w:left="2160" w:hanging="180"/>
+      </w:pPr>
+    </w:lvl>
+    <w:lvl w:ilvl="3" w:tplc="0C00000F">
+      <w:start w:val="1"/>
+      <w:numFmt w:val="decimal"/>
+      <w:lvlText w:val="%4."/>
+      <w:lvlJc w:val="left"/>
+      <w:pPr>
+        <w:ind w:left="2880" w:hanging="360"/>
+      </w:pPr>
+    </w:lvl>
+    <w:lvl w:ilvl="4" w:tplc="0C000019">
+      <w:start w:val="1"/>
+      <w:numFmt w:val="lowerLetter"/>
+      <w:lvlText w:val="%5."/>
+      <w:lvlJc w:val="left"/>
+      <w:pPr>
+        <w:ind w:left="3600" w:hanging="360"/>
+      </w:pPr>
+    </w:lvl>
+    <w:lvl w:ilvl="5" w:tplc="0C00001B">
+      <w:start w:val="1"/>
+      <w:numFmt w:val="lowerRoman"/>
+      <w:lvlText w:val="%6."/>
+      <w:lvlJc w:val="right"/>
+      <w:pPr>
+        <w:ind w:left="4320" w:hanging="180"/>
+      </w:pPr>
+    </w:lvl>
+    <w:lvl w:ilvl="6" w:tplc="0C00000F">
+      <w:start w:val="1"/>
+      <w:numFmt w:val="decimal"/>
+      <w:lvlText w:val="%7."/>
+      <w:lvlJc w:val="left"/>
+      <w:pPr>
+        <w:ind w:left="5040" w:hanging="360"/>
+      </w:pPr>
+    </w:lvl>
+    <w:lvl w:ilvl="7" w:tplc="0C000019">
+      <w:start w:val="1"/>
+      <w:numFmt w:val="lowerLetter"/>
+      <w:lvlText w:val="%8."/>
+      <w:lvlJc w:val="left"/>
+      <w:pPr>
+        <w:ind w:left="5760" w:hanging="360"/>
+      </w:pPr>
+    </w:lvl>
+    <w:lvl w:ilvl="8" w:tplc="0C00001B">
+      <w:start w:val="1"/>
+      <w:numFmt w:val="lowerRoman"/>
+      <w:lvlText w:val="%9."/>
+      <w:lvlJc w:val="right"/>
+      <w:pPr>
+        <w:ind w:left="6480" w:hanging="180"/>
+      </w:pPr>
+    </w:lvl>
+  </w:abstractNum>
+  <w:abstractNum w:abstractNumId="1" w15:restartNumberingAfterBreak="0">
     <w:nsid w:val="6E0B78EF"/>
     <w:multiLevelType w:val="hybridMultilevel"/>
     <w:tmpl w:val="879AA30C"/>
@@ -720,7 +911,37 @@
     </w:lvl>
   </w:abstractNum>
   <w:num w:numId="1">
+    <w:abstractNumId w:val="1"/>
+  </w:num>
+  <w:num w:numId="2">
     <w:abstractNumId w:val="0"/>
+    <w:lvlOverride w:ilvl="0">
+      <w:startOverride w:val="1"/>
+    </w:lvlOverride>
+    <w:lvlOverride w:ilvl="1">
+      <w:startOverride w:val="1"/>
+    </w:lvlOverride>
+    <w:lvlOverride w:ilvl="2">
+      <w:startOverride w:val="1"/>
+    </w:lvlOverride>
+    <w:lvlOverride w:ilvl="3">
+      <w:startOverride w:val="1"/>
+    </w:lvlOverride>
+    <w:lvlOverride w:ilvl="4">
+      <w:startOverride w:val="1"/>
+    </w:lvlOverride>
+    <w:lvlOverride w:ilvl="5">
+      <w:startOverride w:val="1"/>
+    </w:lvlOverride>
+    <w:lvlOverride w:ilvl="6">
+      <w:startOverride w:val="1"/>
+    </w:lvlOverride>
+    <w:lvlOverride w:ilvl="7">
+      <w:startOverride w:val="1"/>
+    </w:lvlOverride>
+    <w:lvlOverride w:ilvl="8">
+      <w:startOverride w:val="1"/>
+    </w:lvlOverride>
   </w:num>
 </w:numbering>
 </file>

</xml_diff>